<commit_message>
Complete service intake demo hardening
</commit_message>
<xml_diff>
--- a/docs/submission/Enterprise_ServiceIntake_Architecture_Design_ForrestZhang.docx
+++ b/docs/submission/Enterprise_ServiceIntake_Architecture_Design_ForrestZhang.docx
@@ -384,7 +384,7 @@
         <w:pStyle w:val="BodyText"/>
       </w:pPr>
       <w:r>
-        <w:t>This solution implements an enterprise-grade external service request intake process using Power Pages, Dataverse, Power Automate, C# plugins, and PCF. External customers submit authenticated multi-step requests, receive real-time routing and SLA feedback, and upload supporting documentation. Dataverse holds the system of record while server-side plugins apply non-bypassable routing and close-validation rules. Power Automate handles manager approval, mock ERP synchronization, and resilient error logging.</w:t>
+        <w:t>This solution implements an enterprise-grade external service request intake process using Power Pages, Dataverse, Power Automate, C# plugins, and PCF. External customers submit authenticated multi-step requests, receive real-time routing and SLA feedback, and upload supporting documentation to SharePoint after submission. Dataverse holds the system of record while server-side plugins apply non-bypassable routing and close-validation rules. Power Automate handles confirmation email, manager approval, mock ERP synchronization, and resilient error logging.</w:t>
       </w:r>
     </w:p>
     <w:p>
@@ -401,6 +401,14 @@
       </w:pPr>
       <w:r>
         <w:t>Customer submits a portal request and receives a formatted confirmation number.</w:t>
+      </w:r>
+    </w:p>
+    <w:p>
+      <w:pPr>
+        <w:pStyle w:val="ListNumber"/>
+      </w:pPr>
+      <w:r>
+        <w:t>Customer can upload supporting files to the SharePoint document library associated to the saved Service Request.</w:t>
       </w:r>
     </w:p>
     <w:p>
@@ -425,6 +433,14 @@
       </w:pPr>
       <w:r>
         <w:t>Critical or high-priority items route to manager approval.</w:t>
+      </w:r>
+    </w:p>
+    <w:p>
+      <w:pPr>
+        <w:pStyle w:val="ListNumber"/>
+      </w:pPr>
+      <w:r>
+        <w:t>Power Automate sends the confirmation number to the applicant and records failures in System Error Logs.</w:t>
       </w:r>
     </w:p>
     <w:p>
@@ -886,7 +902,7 @@
                 <w:color w:val="101828"/>
                 <w:sz w:val="14"/>
               </w:rPr>
-              <w:t>Submit a customer request and verify dynamic SLA/routing preview.</w:t>
+              <w:t>Submit a customer request, verify dynamic SLA/routing preview, and open post-submit SharePoint upload.</w:t>
             </w:r>
           </w:p>
         </w:tc>
@@ -914,7 +930,7 @@
                 <w:color w:val="101828"/>
                 <w:sz w:val="14"/>
               </w:rPr>
-              <w:t>Cloud Flow</w:t>
+              <w:t>Cloud Flows</w:t>
             </w:r>
           </w:p>
         </w:tc>
@@ -940,7 +956,7 @@
                 <w:color w:val="101828"/>
                 <w:sz w:val="14"/>
               </w:rPr>
-              <w:t>ESI - Approval and ERP Sync</w:t>
+              <w:t>ESI - Send Confirmation Email; ESI - Approval and ERP Sync</w:t>
             </w:r>
           </w:p>
         </w:tc>
@@ -966,7 +982,7 @@
                 <w:color w:val="101828"/>
                 <w:sz w:val="14"/>
               </w:rPr>
-              <w:t>Review approval, HTTP sync, run history, and Try/Catch error handling.</w:t>
+              <w:t>Review applicant email, approval, HTTP sync, run history, and Try/Catch error handling.</w:t>
             </w:r>
           </w:p>
         </w:tc>
@@ -1486,7 +1502,7 @@
                 <w:color w:val="101828"/>
                 <w:sz w:val="14"/>
               </w:rPr>
-              <w:t>Provides authenticated customer access, contact-scoped data permissions, multi-step forms, upload support, and Liquid/Web API extensibility.</w:t>
+              <w:t>Provides authenticated customer access, contact-scoped data permissions, multi-step forms, post-submit SharePoint document upload, and Liquid/Web API extensibility.</w:t>
             </w:r>
           </w:p>
         </w:tc>
@@ -1754,7 +1770,7 @@
                 <w:color w:val="101828"/>
                 <w:sz w:val="14"/>
               </w:rPr>
-              <w:t>Approval and ERP sync</w:t>
+              <w:t>Applicant email, approval, and ERP sync</w:t>
             </w:r>
           </w:p>
         </w:tc>
@@ -1806,7 +1822,7 @@
                 <w:color w:val="101828"/>
                 <w:sz w:val="14"/>
               </w:rPr>
-              <w:t>Human approval, HTTP action, connector run history, retry behavior, and clear Try/Catch observability belong in orchestration.</w:t>
+              <w:t>Email delivery, human approval, HTTP action, connector run history, retry behavior, and clear Try/Catch observability belong in orchestration.</w:t>
             </w:r>
           </w:p>
         </w:tc>
@@ -2142,7 +2158,7 @@
                 <w:color w:val="101828"/>
                 <w:sz w:val="14"/>
               </w:rPr>
-              <w:t>Contact, Account, Service Category, Department, SLA Policy, Service Document, External Sync Log, System Error Log</w:t>
+              <w:t>Contact, Account, Service Category, Department, SLA Policy, Service Document, SharePoint Document Location, External Sync Log, System Error Log</w:t>
             </w:r>
           </w:p>
         </w:tc>
@@ -2436,7 +2452,7 @@
                 <w:color w:val="101828"/>
                 <w:sz w:val="14"/>
               </w:rPr>
-              <w:t>Supporting documentation metadata for portal uploads.</w:t>
+              <w:t>Supporting documentation review metadata; binary customer files are uploaded through Power Pages document management into SharePoint after the request exists.</w:t>
             </w:r>
           </w:p>
         </w:tc>
@@ -3005,7 +3021,7 @@
                 <w:color w:val="101828"/>
                 <w:sz w:val="14"/>
               </w:rPr>
-              <w:t>Portal upload step captures supporting documentation metadata.</w:t>
+              <w:t>Post-submit Power Pages document-management page stores supporting files in SharePoint for the saved Service Request.</w:t>
             </w:r>
           </w:p>
         </w:tc>
@@ -3179,7 +3195,7 @@
         <w:pStyle w:val="ListNumber"/>
       </w:pPr>
       <w:r>
-        <w:t>User uploads supporting documentation where needed.</w:t>
+        <w:t>User reviews and submits the request, then receives a confirmation number.</w:t>
       </w:r>
     </w:p>
     <w:p>
@@ -3187,7 +3203,7 @@
         <w:pStyle w:val="ListNumber"/>
       </w:pPr>
       <w:r>
-        <w:t>User reviews and submits the request, then receives a confirmation number.</w:t>
+        <w:t>User opens the secure document upload step and adds files to the SharePoint folder associated with the saved request.</w:t>
       </w:r>
     </w:p>
     <w:p>
@@ -3601,6 +3617,309 @@
         <w:pStyle w:val="Heading2"/>
       </w:pPr>
       <w:r>
+        <w:t>Flow: ESI - Send Confirmation Email</w:t>
+      </w:r>
+    </w:p>
+    <w:tbl>
+      <w:tblPr>
+        <w:tblStyle w:val="TableGrid"/>
+        <w:tblW w:type="auto" w:w="0"/>
+        <w:jc w:val="center"/>
+        <w:tblLayout w:type="fixed"/>
+        <w:tblLook w:firstColumn="1" w:firstRow="1" w:lastColumn="0" w:lastRow="0" w:noHBand="0" w:noVBand="1" w:val="04A0"/>
+      </w:tblPr>
+      <w:tblGrid>
+        <w:gridCol w:w="5040"/>
+        <w:gridCol w:w="5040"/>
+      </w:tblGrid>
+      <w:tr>
+        <w:tc>
+          <w:tcPr>
+            <w:tcW w:type="dxa" w:w="1944"/>
+            <w:vAlign w:val="top"/>
+            <w:shd w:fill="F2F4F7"/>
+            <w:tcBorders>
+              <w:top w:val="single" w:sz="6" w:space="0" w:color="D0D5DD"/>
+              <w:left w:val="single" w:sz="6" w:space="0" w:color="D0D5DD"/>
+              <w:bottom w:val="single" w:sz="6" w:space="0" w:color="D0D5DD"/>
+              <w:right w:val="single" w:sz="6" w:space="0" w:color="D0D5DD"/>
+            </w:tcBorders>
+          </w:tcPr>
+          <w:p>
+            <w:pPr>
+              <w:spacing w:after="0"/>
+            </w:pPr>
+            <w:r>
+              <w:rPr>
+                <w:b/>
+                <w:color w:val="003B66"/>
+              </w:rPr>
+            </w:r>
+            <w:r>
+              <w:rPr>
+                <w:b/>
+                <w:color w:val="003B66"/>
+                <w:sz w:val="16"/>
+              </w:rPr>
+              <w:t>Stage</w:t>
+            </w:r>
+          </w:p>
+        </w:tc>
+        <w:tc>
+          <w:tcPr>
+            <w:tcW w:type="dxa" w:w="7776"/>
+            <w:vAlign w:val="top"/>
+            <w:shd w:fill="F2F4F7"/>
+            <w:tcBorders>
+              <w:top w:val="single" w:sz="6" w:space="0" w:color="D0D5DD"/>
+              <w:left w:val="single" w:sz="6" w:space="0" w:color="D0D5DD"/>
+              <w:bottom w:val="single" w:sz="6" w:space="0" w:color="D0D5DD"/>
+              <w:right w:val="single" w:sz="6" w:space="0" w:color="D0D5DD"/>
+            </w:tcBorders>
+          </w:tcPr>
+          <w:p>
+            <w:pPr>
+              <w:spacing w:after="0"/>
+            </w:pPr>
+            <w:r>
+              <w:rPr>
+                <w:b/>
+                <w:color w:val="003B66"/>
+              </w:rPr>
+            </w:r>
+            <w:r>
+              <w:rPr>
+                <w:b/>
+                <w:color w:val="003B66"/>
+                <w:sz w:val="16"/>
+              </w:rPr>
+              <w:t>Implementation</w:t>
+            </w:r>
+          </w:p>
+        </w:tc>
+      </w:tr>
+      <w:tr>
+        <w:tc>
+          <w:tcPr>
+            <w:tcW w:type="dxa" w:w="1944"/>
+            <w:vAlign w:val="top"/>
+            <w:tcBorders>
+              <w:top w:val="single" w:sz="6" w:space="0" w:color="D0D5DD"/>
+              <w:left w:val="single" w:sz="6" w:space="0" w:color="D0D5DD"/>
+              <w:bottom w:val="single" w:sz="6" w:space="0" w:color="D0D5DD"/>
+              <w:right w:val="single" w:sz="6" w:space="0" w:color="D0D5DD"/>
+            </w:tcBorders>
+          </w:tcPr>
+          <w:p>
+            <w:pPr>
+              <w:spacing w:after="0"/>
+            </w:pPr>
+            <w:r/>
+            <w:r>
+              <w:rPr>
+                <w:b w:val="0"/>
+                <w:color w:val="101828"/>
+                <w:sz w:val="16"/>
+              </w:rPr>
+              <w:t>Trigger</w:t>
+            </w:r>
+          </w:p>
+        </w:tc>
+        <w:tc>
+          <w:tcPr>
+            <w:tcW w:type="dxa" w:w="7776"/>
+            <w:vAlign w:val="top"/>
+            <w:tcBorders>
+              <w:top w:val="single" w:sz="6" w:space="0" w:color="D0D5DD"/>
+              <w:left w:val="single" w:sz="6" w:space="0" w:color="D0D5DD"/>
+              <w:bottom w:val="single" w:sz="6" w:space="0" w:color="D0D5DD"/>
+              <w:right w:val="single" w:sz="6" w:space="0" w:color="D0D5DD"/>
+            </w:tcBorders>
+          </w:tcPr>
+          <w:p>
+            <w:pPr>
+              <w:spacing w:after="0"/>
+            </w:pPr>
+            <w:r/>
+            <w:r>
+              <w:rPr>
+                <w:b w:val="0"/>
+                <w:color w:val="101828"/>
+                <w:sz w:val="16"/>
+              </w:rPr>
+              <w:t>Dataverse row added for Service Request.</w:t>
+            </w:r>
+          </w:p>
+        </w:tc>
+      </w:tr>
+      <w:tr>
+        <w:tc>
+          <w:tcPr>
+            <w:tcW w:type="dxa" w:w="1944"/>
+            <w:vAlign w:val="top"/>
+            <w:tcBorders>
+              <w:top w:val="single" w:sz="6" w:space="0" w:color="D0D5DD"/>
+              <w:left w:val="single" w:sz="6" w:space="0" w:color="D0D5DD"/>
+              <w:bottom w:val="single" w:sz="6" w:space="0" w:color="D0D5DD"/>
+              <w:right w:val="single" w:sz="6" w:space="0" w:color="D0D5DD"/>
+            </w:tcBorders>
+          </w:tcPr>
+          <w:p>
+            <w:pPr>
+              <w:spacing w:after="0"/>
+            </w:pPr>
+            <w:r/>
+            <w:r>
+              <w:rPr>
+                <w:b w:val="0"/>
+                <w:color w:val="101828"/>
+                <w:sz w:val="16"/>
+              </w:rPr>
+              <w:t>Try scope</w:t>
+            </w:r>
+          </w:p>
+        </w:tc>
+        <w:tc>
+          <w:tcPr>
+            <w:tcW w:type="dxa" w:w="7776"/>
+            <w:vAlign w:val="top"/>
+            <w:tcBorders>
+              <w:top w:val="single" w:sz="6" w:space="0" w:color="D0D5DD"/>
+              <w:left w:val="single" w:sz="6" w:space="0" w:color="D0D5DD"/>
+              <w:bottom w:val="single" w:sz="6" w:space="0" w:color="D0D5DD"/>
+              <w:right w:val="single" w:sz="6" w:space="0" w:color="D0D5DD"/>
+            </w:tcBorders>
+          </w:tcPr>
+          <w:p>
+            <w:pPr>
+              <w:spacing w:after="0"/>
+            </w:pPr>
+            <w:r/>
+            <w:r>
+              <w:rPr>
+                <w:b w:val="0"/>
+                <w:color w:val="101828"/>
+                <w:sz w:val="16"/>
+              </w:rPr>
+              <w:t>Validate applicant Contact/email, create a Dataverse Email with the generated confirmation number, send it through the Dataverse SendEmail action, and update customer-visible notes.</w:t>
+            </w:r>
+          </w:p>
+        </w:tc>
+      </w:tr>
+      <w:tr>
+        <w:tc>
+          <w:tcPr>
+            <w:tcW w:type="dxa" w:w="1944"/>
+            <w:vAlign w:val="top"/>
+            <w:tcBorders>
+              <w:top w:val="single" w:sz="6" w:space="0" w:color="D0D5DD"/>
+              <w:left w:val="single" w:sz="6" w:space="0" w:color="D0D5DD"/>
+              <w:bottom w:val="single" w:sz="6" w:space="0" w:color="D0D5DD"/>
+              <w:right w:val="single" w:sz="6" w:space="0" w:color="D0D5DD"/>
+            </w:tcBorders>
+          </w:tcPr>
+          <w:p>
+            <w:pPr>
+              <w:spacing w:after="0"/>
+            </w:pPr>
+            <w:r/>
+            <w:r>
+              <w:rPr>
+                <w:b w:val="0"/>
+                <w:color w:val="101828"/>
+                <w:sz w:val="16"/>
+              </w:rPr>
+              <w:t>Skip path</w:t>
+            </w:r>
+          </w:p>
+        </w:tc>
+        <w:tc>
+          <w:tcPr>
+            <w:tcW w:type="dxa" w:w="7776"/>
+            <w:vAlign w:val="top"/>
+            <w:tcBorders>
+              <w:top w:val="single" w:sz="6" w:space="0" w:color="D0D5DD"/>
+              <w:left w:val="single" w:sz="6" w:space="0" w:color="D0D5DD"/>
+              <w:bottom w:val="single" w:sz="6" w:space="0" w:color="D0D5DD"/>
+              <w:right w:val="single" w:sz="6" w:space="0" w:color="D0D5DD"/>
+            </w:tcBorders>
+          </w:tcPr>
+          <w:p>
+            <w:pPr>
+              <w:spacing w:after="0"/>
+            </w:pPr>
+            <w:r/>
+            <w:r>
+              <w:rPr>
+                <w:b w:val="0"/>
+                <w:color w:val="101828"/>
+                <w:sz w:val="16"/>
+              </w:rPr>
+              <w:t>Missing Contact or email address writes a System Error Log instead of failing silently.</w:t>
+            </w:r>
+          </w:p>
+        </w:tc>
+      </w:tr>
+      <w:tr>
+        <w:tc>
+          <w:tcPr>
+            <w:tcW w:type="dxa" w:w="1944"/>
+            <w:vAlign w:val="top"/>
+            <w:tcBorders>
+              <w:top w:val="single" w:sz="6" w:space="0" w:color="D0D5DD"/>
+              <w:left w:val="single" w:sz="6" w:space="0" w:color="D0D5DD"/>
+              <w:bottom w:val="single" w:sz="6" w:space="0" w:color="D0D5DD"/>
+              <w:right w:val="single" w:sz="6" w:space="0" w:color="D0D5DD"/>
+            </w:tcBorders>
+          </w:tcPr>
+          <w:p>
+            <w:pPr>
+              <w:spacing w:after="0"/>
+            </w:pPr>
+            <w:r/>
+            <w:r>
+              <w:rPr>
+                <w:b w:val="0"/>
+                <w:color w:val="101828"/>
+                <w:sz w:val="16"/>
+              </w:rPr>
+              <w:t>Catch scope</w:t>
+            </w:r>
+          </w:p>
+        </w:tc>
+        <w:tc>
+          <w:tcPr>
+            <w:tcW w:type="dxa" w:w="7776"/>
+            <w:vAlign w:val="top"/>
+            <w:tcBorders>
+              <w:top w:val="single" w:sz="6" w:space="0" w:color="D0D5DD"/>
+              <w:left w:val="single" w:sz="6" w:space="0" w:color="D0D5DD"/>
+              <w:bottom w:val="single" w:sz="6" w:space="0" w:color="D0D5DD"/>
+              <w:right w:val="single" w:sz="6" w:space="0" w:color="D0D5DD"/>
+            </w:tcBorders>
+          </w:tcPr>
+          <w:p>
+            <w:pPr>
+              <w:spacing w:after="0"/>
+            </w:pPr>
+            <w:r/>
+            <w:r>
+              <w:rPr>
+                <w:b w:val="0"/>
+                <w:color w:val="101828"/>
+                <w:sz w:val="16"/>
+              </w:rPr>
+              <w:t>Runs after failure, timeout, or skipped Try scope; writes System Error Log with flow run correlation details.</w:t>
+            </w:r>
+          </w:p>
+        </w:tc>
+      </w:tr>
+    </w:tbl>
+    <w:p>
+      <w:pPr>
+        <w:pStyle w:val="Heading2"/>
+      </w:pPr>
+      <w:r>
         <w:t>Resiliency Pattern</w:t>
       </w:r>
     </w:p>
@@ -3633,7 +3952,7 @@
         <w:pStyle w:val="ListBullet"/>
       </w:pPr>
       <w:r>
-        <w:t>Flow run history and Approval records provide proof if tenant email delivery is restricted.</w:t>
+        <w:t>Flow run history, Dataverse Email rows, and Approval records provide proof if tenant email delivery is restricted.</w:t>
       </w:r>
     </w:p>
     <w:p>
@@ -5055,7 +5374,7 @@
                 <w:color w:val="101828"/>
                 <w:sz w:val="14"/>
               </w:rPr>
-              <w:t>Dynamic preview shows Finance, 4 hour SLA, approval required, and documentation required for critical funding requests.</w:t>
+              <w:t>Dynamic preview shows Finance, 4 hour SLA, approval required, and post-submit SharePoint upload is available from the confirmation dialog.</w:t>
             </w:r>
           </w:p>
         </w:tc>
@@ -5109,7 +5428,7 @@
                 <w:color w:val="101828"/>
                 <w:sz w:val="14"/>
               </w:rPr>
-              <w:t>Portal demo request created with formatted confirmation SR-20260521-001004.</w:t>
+              <w:t>Portal demo request created with formatted confirmation SR-20260521-001004; confirmation email smoke test created SR-20260521-001016.</w:t>
             </w:r>
           </w:p>
         </w:tc>
@@ -5191,7 +5510,7 @@
                 <w:color w:val="101828"/>
                 <w:sz w:val="14"/>
               </w:rPr>
-              <w:t>Flow</w:t>
+              <w:t>Flows</w:t>
             </w:r>
           </w:p>
         </w:tc>
@@ -5217,7 +5536,7 @@
                 <w:color w:val="101828"/>
                 <w:sz w:val="14"/>
               </w:rPr>
-              <w:t>Active, solution-aware, and includes approval, HTTP sync, reject branch, External Sync Log, and Catch error-log scope.</w:t>
+              <w:t>Approval/ERP flow and confirmation email flow are active, solution-aware, and use Try/Catch logging patterns.</w:t>
             </w:r>
           </w:p>
         </w:tc>
@@ -5290,7 +5609,7 @@
         <w:pStyle w:val="ListBullet"/>
       </w:pPr>
       <w:r>
-        <w:t>If email delivery is restricted, use Approval records and Flow run history as evidence.</w:t>
+        <w:t>If email delivery is restricted, use Dataverse Email records, Approval records, and Flow run history as evidence.</w:t>
       </w:r>
     </w:p>
     <w:p>

</xml_diff>